<commit_message>
R2/R3a/R3b: statutory re-parse of original/articulados
- jar rebuilt from lexml-parser-projeto-lei ebf6567, batch_parse.py
  --no-justificativa (lexml/articulados/PARSER_VERSION); 214 converted;
  stale LexML of removed/moved documents deleted
- MP 2.189-49: arts. 1-6 (revoked by Lei 14.754/2023, in force in 2023)
  un-struck with scripts/lexml/unstrike_revoked.py (cause 2a)
- scripts/lexml/audit_article_coverage.py: gate passes; treaty articles
  listed in scripts/lexml/unmatchable_articles.tsv (cause 2f, D7)

Co-Authored-By: Claude Opus 5.5 <noreply@anthropic.com>
</commit_message>
<xml_diff>
--- a/original/articulados/mp_2189-49_20010823.docx
+++ b/original/articulados/mp_2189-49_20010823.docx
@@ -345,7 +345,6 @@
           <w:bCs w:val="false"/>
           <w:i w:val="false"/>
           <w:iCs w:val="false"/>
-          <w:strike/>
           <w:sz w:val="20"/>
           <w:szCs w:val="20"/>
         </w:rPr>
@@ -358,7 +357,6 @@
           <w:bCs w:val="false"/>
           <w:i w:val="false"/>
           <w:iCs w:val="false"/>
-          <w:strike/>
           <w:sz w:val="20"/>
           <w:szCs w:val="20"/>
           <w:vertAlign w:val="superscript"/>
@@ -372,7 +370,6 @@
           <w:bCs w:val="false"/>
           <w:i w:val="false"/>
           <w:iCs w:val="false"/>
-          <w:strike/>
           <w:sz w:val="20"/>
           <w:szCs w:val="20"/>
         </w:rPr>
@@ -386,7 +383,6 @@
             <w:bCs w:val="false"/>
             <w:i w:val="false"/>
             <w:iCs w:val="false"/>
-            <w:strike/>
             <w:color w:val="0000EE"/>
             <w:sz w:val="20"/>
             <w:szCs w:val="20"/>
@@ -403,7 +399,6 @@
             <w:bCs w:val="false"/>
             <w:i w:val="false"/>
             <w:iCs w:val="false"/>
-            <w:strike/>
             <w:color w:val="0000EE"/>
             <w:sz w:val="20"/>
             <w:szCs w:val="20"/>
@@ -421,7 +416,6 @@
             <w:bCs w:val="false"/>
             <w:i w:val="false"/>
             <w:iCs w:val="false"/>
-            <w:strike/>
             <w:color w:val="0000EE"/>
             <w:sz w:val="20"/>
             <w:szCs w:val="20"/>
@@ -438,7 +432,6 @@
             <w:bCs w:val="false"/>
             <w:i w:val="false"/>
             <w:iCs w:val="false"/>
-            <w:strike/>
             <w:color w:val="0000EE"/>
             <w:sz w:val="20"/>
             <w:szCs w:val="20"/>
@@ -456,7 +449,6 @@
             <w:bCs w:val="false"/>
             <w:i w:val="false"/>
             <w:iCs w:val="false"/>
-            <w:strike/>
             <w:color w:val="0000EE"/>
             <w:sz w:val="20"/>
             <w:szCs w:val="20"/>
@@ -472,7 +464,6 @@
           <w:bCs w:val="false"/>
           <w:i w:val="false"/>
           <w:iCs w:val="false"/>
-          <w:strike/>
           <w:sz w:val="20"/>
           <w:szCs w:val="20"/>
         </w:rPr>
@@ -485,7 +476,6 @@
           <w:bCs w:val="false"/>
           <w:i w:val="false"/>
           <w:iCs w:val="false"/>
-          <w:strike/>
           <w:sz w:val="20"/>
           <w:szCs w:val="20"/>
           <w:vertAlign w:val="superscript"/>
@@ -499,7 +489,6 @@
           <w:bCs w:val="false"/>
           <w:i w:val="false"/>
           <w:iCs w:val="false"/>
-          <w:strike/>
           <w:sz w:val="20"/>
           <w:szCs w:val="20"/>
         </w:rPr>
@@ -513,7 +502,6 @@
             <w:bCs w:val="false"/>
             <w:i w:val="false"/>
             <w:iCs w:val="false"/>
-            <w:strike/>
             <w:color w:val="0000EE"/>
             <w:sz w:val="20"/>
             <w:szCs w:val="20"/>
@@ -529,7 +517,6 @@
           <w:bCs w:val="false"/>
           <w:i w:val="false"/>
           <w:iCs w:val="false"/>
-          <w:strike/>
           <w:sz w:val="20"/>
           <w:szCs w:val="20"/>
         </w:rPr>
@@ -543,7 +530,6 @@
             <w:bCs w:val="false"/>
             <w:i w:val="false"/>
             <w:iCs w:val="false"/>
-            <w:strike/>
             <w:color w:val="0000EE"/>
             <w:sz w:val="20"/>
             <w:szCs w:val="20"/>
@@ -559,7 +545,6 @@
           <w:bCs w:val="false"/>
           <w:i w:val="false"/>
           <w:iCs w:val="false"/>
-          <w:strike/>
           <w:sz w:val="20"/>
           <w:szCs w:val="20"/>
         </w:rPr>
@@ -573,7 +558,6 @@
             <w:bCs w:val="false"/>
             <w:i w:val="false"/>
             <w:iCs w:val="false"/>
-            <w:strike w:val="false"/>
             <w:color w:val="0000EE"/>
             <w:sz w:val="20"/>
             <w:szCs w:val="20"/>
@@ -589,7 +573,6 @@
           <w:bCs w:val="false"/>
           <w:i w:val="false"/>
           <w:iCs w:val="false"/>
-          <w:strike w:val="false"/>
           <w:sz w:val="20"/>
           <w:szCs w:val="20"/>
         </w:rPr>
@@ -603,7 +586,6 @@
             <w:bCs w:val="false"/>
             <w:i w:val="false"/>
             <w:iCs w:val="false"/>
-            <w:strike w:val="false"/>
             <w:color w:val="0000EE"/>
             <w:sz w:val="20"/>
             <w:szCs w:val="20"/>
@@ -626,7 +608,6 @@
           <w:bCs w:val="false"/>
           <w:i w:val="false"/>
           <w:iCs w:val="false"/>
-          <w:strike/>
           <w:sz w:val="20"/>
           <w:szCs w:val="20"/>
         </w:rPr>
@@ -639,7 +620,6 @@
           <w:bCs w:val="false"/>
           <w:i w:val="false"/>
           <w:iCs w:val="false"/>
-          <w:strike/>
           <w:sz w:val="20"/>
           <w:szCs w:val="20"/>
           <w:vertAlign w:val="superscript"/>
@@ -653,7 +633,6 @@
           <w:bCs w:val="false"/>
           <w:i w:val="false"/>
           <w:iCs w:val="false"/>
-          <w:strike/>
           <w:sz w:val="20"/>
           <w:szCs w:val="20"/>
         </w:rPr>
@@ -667,7 +646,6 @@
             <w:bCs w:val="false"/>
             <w:i w:val="false"/>
             <w:iCs w:val="false"/>
-            <w:strike/>
             <w:color w:val="0000EE"/>
             <w:sz w:val="20"/>
             <w:szCs w:val="20"/>
@@ -684,7 +662,6 @@
             <w:bCs w:val="false"/>
             <w:i w:val="false"/>
             <w:iCs w:val="false"/>
-            <w:strike/>
             <w:color w:val="0000EE"/>
             <w:sz w:val="20"/>
             <w:szCs w:val="20"/>
@@ -702,7 +679,6 @@
             <w:bCs w:val="false"/>
             <w:i w:val="false"/>
             <w:iCs w:val="false"/>
-            <w:strike/>
             <w:color w:val="0000EE"/>
             <w:sz w:val="20"/>
             <w:szCs w:val="20"/>
@@ -719,7 +695,6 @@
             <w:bCs w:val="false"/>
             <w:i w:val="false"/>
             <w:iCs w:val="false"/>
-            <w:strike/>
             <w:color w:val="0000EE"/>
             <w:sz w:val="20"/>
             <w:szCs w:val="20"/>
@@ -737,7 +712,6 @@
             <w:bCs w:val="false"/>
             <w:i w:val="false"/>
             <w:iCs w:val="false"/>
-            <w:strike/>
             <w:color w:val="0000EE"/>
             <w:sz w:val="20"/>
             <w:szCs w:val="20"/>
@@ -753,7 +727,6 @@
           <w:bCs w:val="false"/>
           <w:i w:val="false"/>
           <w:iCs w:val="false"/>
-          <w:strike/>
           <w:sz w:val="20"/>
           <w:szCs w:val="20"/>
         </w:rPr>
@@ -767,7 +740,6 @@
             <w:bCs w:val="false"/>
             <w:i w:val="false"/>
             <w:iCs w:val="false"/>
-            <w:strike/>
             <w:color w:val="0000EE"/>
             <w:sz w:val="20"/>
             <w:szCs w:val="20"/>
@@ -783,7 +755,6 @@
           <w:bCs w:val="false"/>
           <w:i w:val="false"/>
           <w:iCs w:val="false"/>
-          <w:strike/>
           <w:sz w:val="20"/>
           <w:szCs w:val="20"/>
         </w:rPr>
@@ -797,7 +768,6 @@
             <w:bCs w:val="false"/>
             <w:i w:val="false"/>
             <w:iCs w:val="false"/>
-            <w:strike/>
             <w:color w:val="0000EE"/>
             <w:sz w:val="20"/>
             <w:szCs w:val="20"/>
@@ -813,7 +783,6 @@
           <w:bCs w:val="false"/>
           <w:i w:val="false"/>
           <w:iCs w:val="false"/>
-          <w:strike/>
           <w:sz w:val="20"/>
           <w:szCs w:val="20"/>
         </w:rPr>
@@ -827,7 +796,6 @@
             <w:bCs w:val="false"/>
             <w:i w:val="false"/>
             <w:iCs w:val="false"/>
-            <w:strike w:val="false"/>
             <w:color w:val="0000EE"/>
             <w:sz w:val="20"/>
             <w:szCs w:val="20"/>
@@ -843,7 +811,6 @@
           <w:bCs w:val="false"/>
           <w:i w:val="false"/>
           <w:iCs w:val="false"/>
-          <w:strike w:val="false"/>
           <w:sz w:val="20"/>
           <w:szCs w:val="20"/>
         </w:rPr>
@@ -857,7 +824,6 @@
             <w:bCs w:val="false"/>
             <w:i w:val="false"/>
             <w:iCs w:val="false"/>
-            <w:strike w:val="false"/>
             <w:color w:val="0000EE"/>
             <w:sz w:val="20"/>
             <w:szCs w:val="20"/>
@@ -880,7 +846,6 @@
           <w:bCs w:val="false"/>
           <w:i w:val="false"/>
           <w:iCs w:val="false"/>
-          <w:strike/>
           <w:sz w:val="20"/>
           <w:szCs w:val="20"/>
         </w:rPr>
@@ -893,7 +858,6 @@
           <w:bCs w:val="false"/>
           <w:i w:val="false"/>
           <w:iCs w:val="false"/>
-          <w:strike/>
           <w:sz w:val="20"/>
           <w:szCs w:val="20"/>
           <w:vertAlign w:val="superscript"/>
@@ -907,7 +871,6 @@
           <w:bCs w:val="false"/>
           <w:i w:val="false"/>
           <w:iCs w:val="false"/>
-          <w:strike/>
           <w:sz w:val="20"/>
           <w:szCs w:val="20"/>
         </w:rPr>
@@ -921,7 +884,6 @@
             <w:bCs w:val="false"/>
             <w:i w:val="false"/>
             <w:iCs w:val="false"/>
-            <w:strike/>
             <w:color w:val="0000EE"/>
             <w:sz w:val="20"/>
             <w:szCs w:val="20"/>
@@ -938,7 +900,6 @@
             <w:bCs w:val="false"/>
             <w:i w:val="false"/>
             <w:iCs w:val="false"/>
-            <w:strike/>
             <w:color w:val="0000EE"/>
             <w:sz w:val="20"/>
             <w:szCs w:val="20"/>
@@ -956,7 +917,6 @@
             <w:bCs w:val="false"/>
             <w:i w:val="false"/>
             <w:iCs w:val="false"/>
-            <w:strike/>
             <w:color w:val="0000EE"/>
             <w:sz w:val="20"/>
             <w:szCs w:val="20"/>
@@ -972,7 +932,6 @@
           <w:bCs w:val="false"/>
           <w:i w:val="false"/>
           <w:iCs w:val="false"/>
-          <w:strike/>
           <w:sz w:val="20"/>
           <w:szCs w:val="20"/>
         </w:rPr>
@@ -985,7 +944,6 @@
           <w:bCs w:val="false"/>
           <w:i w:val="false"/>
           <w:iCs w:val="false"/>
-          <w:strike/>
           <w:sz w:val="20"/>
           <w:szCs w:val="20"/>
           <w:vertAlign w:val="superscript"/>
@@ -999,7 +957,6 @@
           <w:bCs w:val="false"/>
           <w:i w:val="false"/>
           <w:iCs w:val="false"/>
-          <w:strike/>
           <w:sz w:val="20"/>
           <w:szCs w:val="20"/>
         </w:rPr>
@@ -1013,7 +970,6 @@
             <w:bCs w:val="false"/>
             <w:i w:val="false"/>
             <w:iCs w:val="false"/>
-            <w:strike/>
             <w:color w:val="0000EE"/>
             <w:sz w:val="20"/>
             <w:szCs w:val="20"/>
@@ -1029,7 +985,6 @@
           <w:bCs w:val="false"/>
           <w:i w:val="false"/>
           <w:iCs w:val="false"/>
-          <w:strike/>
           <w:sz w:val="20"/>
           <w:szCs w:val="20"/>
         </w:rPr>
@@ -1043,7 +998,6 @@
             <w:bCs w:val="false"/>
             <w:i w:val="false"/>
             <w:iCs w:val="false"/>
-            <w:strike/>
             <w:color w:val="0000EE"/>
             <w:sz w:val="20"/>
             <w:szCs w:val="20"/>
@@ -1059,7 +1013,6 @@
           <w:bCs w:val="false"/>
           <w:i w:val="false"/>
           <w:iCs w:val="false"/>
-          <w:strike/>
           <w:sz w:val="20"/>
           <w:szCs w:val="20"/>
         </w:rPr>
@@ -1072,7 +1025,6 @@
           <w:bCs w:val="false"/>
           <w:i w:val="false"/>
           <w:iCs w:val="false"/>
-          <w:strike w:val="false"/>
           <w:sz w:val="20"/>
           <w:szCs w:val="20"/>
         </w:rPr>
@@ -1086,7 +1038,6 @@
             <w:bCs w:val="false"/>
             <w:i w:val="false"/>
             <w:iCs w:val="false"/>
-            <w:strike w:val="false"/>
             <w:color w:val="0000EE"/>
             <w:sz w:val="20"/>
             <w:szCs w:val="20"/>
@@ -1102,7 +1053,6 @@
           <w:bCs w:val="false"/>
           <w:i w:val="false"/>
           <w:iCs w:val="false"/>
-          <w:strike w:val="false"/>
           <w:sz w:val="20"/>
           <w:szCs w:val="20"/>
         </w:rPr>
@@ -1116,7 +1066,6 @@
             <w:bCs w:val="false"/>
             <w:i w:val="false"/>
             <w:iCs w:val="false"/>
-            <w:strike w:val="false"/>
             <w:color w:val="0000EE"/>
             <w:sz w:val="20"/>
             <w:szCs w:val="20"/>
@@ -1139,7 +1088,6 @@
           <w:bCs w:val="false"/>
           <w:i w:val="false"/>
           <w:iCs w:val="false"/>
-          <w:strike/>
           <w:sz w:val="20"/>
           <w:szCs w:val="20"/>
         </w:rPr>
@@ -1152,7 +1100,6 @@
           <w:bCs w:val="false"/>
           <w:i w:val="false"/>
           <w:iCs w:val="false"/>
-          <w:strike/>
           <w:sz w:val="20"/>
           <w:szCs w:val="20"/>
           <w:vertAlign w:val="superscript"/>
@@ -1166,7 +1113,6 @@
           <w:bCs w:val="false"/>
           <w:i w:val="false"/>
           <w:iCs w:val="false"/>
-          <w:strike/>
           <w:sz w:val="20"/>
           <w:szCs w:val="20"/>
         </w:rPr>
@@ -1180,7 +1126,6 @@
             <w:bCs w:val="false"/>
             <w:i w:val="false"/>
             <w:iCs w:val="false"/>
-            <w:strike/>
             <w:color w:val="0000EE"/>
             <w:sz w:val="20"/>
             <w:szCs w:val="20"/>
@@ -1196,7 +1141,6 @@
           <w:bCs w:val="false"/>
           <w:i w:val="false"/>
           <w:iCs w:val="false"/>
-          <w:strike/>
           <w:sz w:val="20"/>
           <w:szCs w:val="20"/>
         </w:rPr>
@@ -1210,7 +1154,6 @@
             <w:bCs w:val="false"/>
             <w:i w:val="false"/>
             <w:iCs w:val="false"/>
-            <w:strike/>
             <w:color w:val="0000EE"/>
             <w:sz w:val="20"/>
             <w:szCs w:val="20"/>
@@ -1226,7 +1169,6 @@
           <w:bCs w:val="false"/>
           <w:i w:val="false"/>
           <w:iCs w:val="false"/>
-          <w:strike/>
           <w:sz w:val="20"/>
           <w:szCs w:val="20"/>
         </w:rPr>
@@ -1239,7 +1181,6 @@
           <w:bCs w:val="false"/>
           <w:i w:val="false"/>
           <w:iCs w:val="false"/>
-          <w:strike w:val="false"/>
           <w:sz w:val="20"/>
           <w:szCs w:val="20"/>
         </w:rPr>
@@ -1253,7 +1194,6 @@
             <w:bCs w:val="false"/>
             <w:i w:val="false"/>
             <w:iCs w:val="false"/>
-            <w:strike w:val="false"/>
             <w:color w:val="0000EE"/>
             <w:sz w:val="20"/>
             <w:szCs w:val="20"/>
@@ -1269,7 +1209,6 @@
           <w:bCs w:val="false"/>
           <w:i w:val="false"/>
           <w:iCs w:val="false"/>
-          <w:strike w:val="false"/>
           <w:sz w:val="20"/>
           <w:szCs w:val="20"/>
         </w:rPr>
@@ -1283,7 +1222,6 @@
             <w:bCs w:val="false"/>
             <w:i w:val="false"/>
             <w:iCs w:val="false"/>
-            <w:strike w:val="false"/>
             <w:color w:val="0000EE"/>
             <w:sz w:val="20"/>
             <w:szCs w:val="20"/>
@@ -1306,7 +1244,6 @@
           <w:bCs w:val="false"/>
           <w:i w:val="false"/>
           <w:iCs w:val="false"/>
-          <w:strike/>
           <w:sz w:val="20"/>
           <w:szCs w:val="20"/>
         </w:rPr>
@@ -1326,7 +1263,6 @@
           <w:bCs w:val="false"/>
           <w:i w:val="false"/>
           <w:iCs w:val="false"/>
-          <w:strike/>
           <w:sz w:val="20"/>
           <w:szCs w:val="20"/>
         </w:rPr>
@@ -1339,7 +1275,6 @@
           <w:bCs w:val="false"/>
           <w:i w:val="false"/>
           <w:iCs w:val="false"/>
-          <w:strike/>
           <w:sz w:val="20"/>
           <w:szCs w:val="20"/>
           <w:vertAlign w:val="superscript"/>
@@ -1353,7 +1288,6 @@
           <w:bCs w:val="false"/>
           <w:i w:val="false"/>
           <w:iCs w:val="false"/>
-          <w:strike/>
           <w:sz w:val="20"/>
           <w:szCs w:val="20"/>
         </w:rPr>
@@ -1373,7 +1307,6 @@
           <w:bCs w:val="false"/>
           <w:i w:val="false"/>
           <w:iCs w:val="false"/>
-          <w:strike/>
           <w:sz w:val="20"/>
           <w:szCs w:val="20"/>
         </w:rPr>
@@ -1387,7 +1320,6 @@
             <w:bCs w:val="false"/>
             <w:i w:val="false"/>
             <w:iCs w:val="false"/>
-            <w:strike/>
             <w:color w:val="0000EE"/>
             <w:sz w:val="20"/>
             <w:szCs w:val="20"/>
@@ -1404,7 +1336,6 @@
             <w:bCs w:val="false"/>
             <w:i w:val="false"/>
             <w:iCs w:val="false"/>
-            <w:strike/>
             <w:color w:val="0000EE"/>
             <w:sz w:val="20"/>
             <w:szCs w:val="20"/>
@@ -1422,7 +1353,6 @@
             <w:bCs w:val="false"/>
             <w:i w:val="false"/>
             <w:iCs w:val="false"/>
-            <w:strike/>
             <w:color w:val="0000EE"/>
             <w:sz w:val="20"/>
             <w:szCs w:val="20"/>
@@ -1438,7 +1368,6 @@
           <w:bCs w:val="false"/>
           <w:i w:val="false"/>
           <w:iCs w:val="false"/>
-          <w:strike/>
           <w:sz w:val="20"/>
           <w:szCs w:val="20"/>
         </w:rPr>
@@ -1451,7 +1380,6 @@
           <w:bCs w:val="false"/>
           <w:i w:val="false"/>
           <w:iCs w:val="false"/>
-          <w:strike/>
           <w:sz w:val="20"/>
           <w:szCs w:val="20"/>
           <w:vertAlign w:val="superscript"/>
@@ -1465,7 +1393,6 @@
           <w:bCs w:val="false"/>
           <w:i w:val="false"/>
           <w:iCs w:val="false"/>
-          <w:strike/>
           <w:sz w:val="20"/>
           <w:szCs w:val="20"/>
         </w:rPr>
@@ -1485,7 +1412,6 @@
           <w:bCs w:val="false"/>
           <w:i w:val="false"/>
           <w:iCs w:val="false"/>
-          <w:strike/>
           <w:sz w:val="20"/>
           <w:szCs w:val="20"/>
         </w:rPr>
@@ -1505,7 +1431,6 @@
           <w:bCs w:val="false"/>
           <w:i w:val="false"/>
           <w:iCs w:val="false"/>
-          <w:strike/>
           <w:sz w:val="20"/>
           <w:szCs w:val="20"/>
         </w:rPr>
@@ -1519,7 +1444,6 @@
             <w:bCs w:val="false"/>
             <w:i w:val="false"/>
             <w:iCs w:val="false"/>
-            <w:strike/>
             <w:color w:val="0000EE"/>
             <w:sz w:val="20"/>
             <w:szCs w:val="20"/>
@@ -1536,7 +1460,6 @@
             <w:bCs w:val="false"/>
             <w:i w:val="false"/>
             <w:iCs w:val="false"/>
-            <w:strike/>
             <w:color w:val="0000EE"/>
             <w:sz w:val="20"/>
             <w:szCs w:val="20"/>
@@ -1554,7 +1477,6 @@
             <w:bCs w:val="false"/>
             <w:i w:val="false"/>
             <w:iCs w:val="false"/>
-            <w:strike/>
             <w:color w:val="0000EE"/>
             <w:sz w:val="20"/>
             <w:szCs w:val="20"/>
@@ -1571,7 +1493,6 @@
             <w:bCs w:val="false"/>
             <w:i w:val="false"/>
             <w:iCs w:val="false"/>
-            <w:strike/>
             <w:color w:val="0000EE"/>
             <w:sz w:val="20"/>
             <w:szCs w:val="20"/>
@@ -1589,7 +1510,6 @@
             <w:bCs w:val="false"/>
             <w:i w:val="false"/>
             <w:iCs w:val="false"/>
-            <w:strike/>
             <w:color w:val="0000EE"/>
             <w:sz w:val="20"/>
             <w:szCs w:val="20"/>
@@ -1612,7 +1532,6 @@
           <w:bCs w:val="false"/>
           <w:i w:val="false"/>
           <w:iCs w:val="false"/>
-          <w:strike/>
           <w:sz w:val="20"/>
           <w:szCs w:val="20"/>
         </w:rPr>
@@ -1625,7 +1544,6 @@
           <w:bCs w:val="false"/>
           <w:i w:val="false"/>
           <w:iCs w:val="false"/>
-          <w:strike/>
           <w:sz w:val="20"/>
           <w:szCs w:val="20"/>
           <w:vertAlign w:val="superscript"/>
@@ -1639,7 +1557,6 @@
           <w:bCs w:val="false"/>
           <w:i w:val="false"/>
           <w:iCs w:val="false"/>
-          <w:strike/>
           <w:sz w:val="20"/>
           <w:szCs w:val="20"/>
         </w:rPr>
@@ -1653,7 +1570,6 @@
             <w:bCs w:val="false"/>
             <w:i w:val="false"/>
             <w:iCs w:val="false"/>
-            <w:strike/>
             <w:color w:val="0000EE"/>
             <w:sz w:val="20"/>
             <w:szCs w:val="20"/>
@@ -1669,7 +1585,6 @@
           <w:bCs w:val="false"/>
           <w:i w:val="false"/>
           <w:iCs w:val="false"/>
-          <w:strike/>
           <w:sz w:val="20"/>
           <w:szCs w:val="20"/>
         </w:rPr>
@@ -1683,7 +1598,6 @@
             <w:bCs w:val="false"/>
             <w:i w:val="false"/>
             <w:iCs w:val="false"/>
-            <w:strike/>
             <w:color w:val="0000EE"/>
             <w:sz w:val="20"/>
             <w:szCs w:val="20"/>
@@ -1699,7 +1613,6 @@
           <w:bCs w:val="false"/>
           <w:i w:val="false"/>
           <w:iCs w:val="false"/>
-          <w:strike/>
           <w:sz w:val="20"/>
           <w:szCs w:val="20"/>
         </w:rPr>
@@ -1713,7 +1626,6 @@
             <w:bCs w:val="false"/>
             <w:i w:val="false"/>
             <w:iCs w:val="false"/>
-            <w:strike w:val="false"/>
             <w:color w:val="0000EE"/>
             <w:sz w:val="20"/>
             <w:szCs w:val="20"/>
@@ -1729,7 +1641,6 @@
           <w:bCs w:val="false"/>
           <w:i w:val="false"/>
           <w:iCs w:val="false"/>
-          <w:strike w:val="false"/>
           <w:sz w:val="20"/>
           <w:szCs w:val="20"/>
         </w:rPr>
@@ -1743,7 +1654,6 @@
             <w:bCs w:val="false"/>
             <w:i w:val="false"/>
             <w:iCs w:val="false"/>
-            <w:strike w:val="false"/>
             <w:color w:val="0000EE"/>
             <w:sz w:val="20"/>
             <w:szCs w:val="20"/>
@@ -1766,7 +1676,6 @@
           <w:bCs w:val="false"/>
           <w:i w:val="false"/>
           <w:iCs w:val="false"/>
-          <w:strike/>
           <w:sz w:val="20"/>
           <w:szCs w:val="20"/>
         </w:rPr>
@@ -1780,7 +1689,6 @@
             <w:bCs w:val="false"/>
             <w:i w:val="false"/>
             <w:iCs w:val="false"/>
-            <w:strike/>
             <w:color w:val="0000EE"/>
             <w:sz w:val="20"/>
             <w:szCs w:val="20"/>
@@ -1797,7 +1705,6 @@
             <w:bCs w:val="false"/>
             <w:i w:val="false"/>
             <w:iCs w:val="false"/>
-            <w:strike/>
             <w:color w:val="0000EE"/>
             <w:sz w:val="20"/>
             <w:szCs w:val="20"/>
@@ -1815,7 +1722,6 @@
             <w:bCs w:val="false"/>
             <w:i w:val="false"/>
             <w:iCs w:val="false"/>
-            <w:strike/>
             <w:color w:val="0000EE"/>
             <w:sz w:val="20"/>
             <w:szCs w:val="20"/>
@@ -1831,7 +1737,6 @@
           <w:bCs w:val="false"/>
           <w:i w:val="false"/>
           <w:iCs w:val="false"/>
-          <w:strike/>
           <w:sz w:val="20"/>
           <w:szCs w:val="20"/>
         </w:rPr>
@@ -1851,7 +1756,6 @@
           <w:bCs w:val="false"/>
           <w:i w:val="false"/>
           <w:iCs w:val="false"/>
-          <w:strike/>
           <w:sz w:val="20"/>
           <w:szCs w:val="20"/>
         </w:rPr>
@@ -1864,7 +1768,6 @@
           <w:bCs w:val="false"/>
           <w:i w:val="false"/>
           <w:iCs w:val="false"/>
-          <w:strike/>
           <w:sz w:val="20"/>
           <w:szCs w:val="20"/>
           <w:vertAlign w:val="superscript"/>
@@ -1878,7 +1781,6 @@
           <w:bCs w:val="false"/>
           <w:i w:val="false"/>
           <w:iCs w:val="false"/>
-          <w:strike/>
           <w:sz w:val="20"/>
           <w:szCs w:val="20"/>
         </w:rPr>
@@ -1898,7 +1800,6 @@
           <w:bCs w:val="false"/>
           <w:i w:val="false"/>
           <w:iCs w:val="false"/>
-          <w:strike/>
           <w:sz w:val="20"/>
           <w:szCs w:val="20"/>
         </w:rPr>
@@ -1918,7 +1819,6 @@
           <w:bCs w:val="false"/>
           <w:i w:val="false"/>
           <w:iCs w:val="false"/>
-          <w:strike/>
           <w:sz w:val="20"/>
           <w:szCs w:val="20"/>
         </w:rPr>
@@ -1931,7 +1831,6 @@
           <w:bCs w:val="false"/>
           <w:i w:val="false"/>
           <w:iCs w:val="false"/>
-          <w:strike/>
           <w:sz w:val="20"/>
           <w:szCs w:val="20"/>
           <w:vertAlign w:val="superscript"/>
@@ -1945,7 +1844,6 @@
           <w:bCs w:val="false"/>
           <w:i w:val="false"/>
           <w:iCs w:val="false"/>
-          <w:strike/>
           <w:sz w:val="20"/>
           <w:szCs w:val="20"/>
         </w:rPr>
@@ -1959,7 +1857,6 @@
             <w:bCs w:val="false"/>
             <w:i w:val="false"/>
             <w:iCs w:val="false"/>
-            <w:strike/>
             <w:color w:val="0000EE"/>
             <w:sz w:val="20"/>
             <w:szCs w:val="20"/>
@@ -1976,7 +1873,6 @@
             <w:bCs w:val="false"/>
             <w:i w:val="false"/>
             <w:iCs w:val="false"/>
-            <w:strike/>
             <w:color w:val="0000EE"/>
             <w:sz w:val="20"/>
             <w:szCs w:val="20"/>
@@ -1994,7 +1890,6 @@
             <w:bCs w:val="false"/>
             <w:i w:val="false"/>
             <w:iCs w:val="false"/>
-            <w:strike/>
             <w:color w:val="0000EE"/>
             <w:sz w:val="20"/>
             <w:szCs w:val="20"/>
@@ -2011,7 +1906,6 @@
             <w:bCs w:val="false"/>
             <w:i w:val="false"/>
             <w:iCs w:val="false"/>
-            <w:strike/>
             <w:color w:val="0000EE"/>
             <w:sz w:val="20"/>
             <w:szCs w:val="20"/>
@@ -2029,7 +1923,6 @@
             <w:bCs w:val="false"/>
             <w:i w:val="false"/>
             <w:iCs w:val="false"/>
-            <w:strike/>
             <w:color w:val="0000EE"/>
             <w:sz w:val="20"/>
             <w:szCs w:val="20"/>
@@ -2045,7 +1938,6 @@
           <w:bCs w:val="false"/>
           <w:i w:val="false"/>
           <w:iCs w:val="false"/>
-          <w:strike/>
           <w:sz w:val="20"/>
           <w:szCs w:val="20"/>
         </w:rPr>
@@ -2058,7 +1950,6 @@
           <w:bCs w:val="false"/>
           <w:i w:val="false"/>
           <w:iCs w:val="false"/>
-          <w:strike/>
           <w:sz w:val="20"/>
           <w:szCs w:val="20"/>
           <w:vertAlign w:val="superscript"/>
@@ -2072,7 +1963,6 @@
           <w:bCs w:val="false"/>
           <w:i w:val="false"/>
           <w:iCs w:val="false"/>
-          <w:strike/>
           <w:sz w:val="20"/>
           <w:szCs w:val="20"/>
         </w:rPr>
@@ -2092,7 +1982,6 @@
           <w:bCs w:val="false"/>
           <w:i w:val="false"/>
           <w:iCs w:val="false"/>
-          <w:strike/>
           <w:sz w:val="20"/>
           <w:szCs w:val="20"/>
         </w:rPr>
@@ -2105,7 +1994,6 @@
           <w:bCs w:val="false"/>
           <w:i w:val="false"/>
           <w:iCs w:val="false"/>
-          <w:strike/>
           <w:sz w:val="20"/>
           <w:szCs w:val="20"/>
           <w:vertAlign w:val="superscript"/>
@@ -2119,7 +2007,6 @@
           <w:bCs w:val="false"/>
           <w:i w:val="false"/>
           <w:iCs w:val="false"/>
-          <w:strike/>
           <w:sz w:val="20"/>
           <w:szCs w:val="20"/>
         </w:rPr>
@@ -2132,7 +2019,6 @@
           <w:bCs w:val="false"/>
           <w:i w:val="false"/>
           <w:iCs w:val="false"/>
-          <w:strike/>
           <w:sz w:val="20"/>
           <w:szCs w:val="20"/>
           <w:vertAlign w:val="superscript"/>
@@ -2146,7 +2032,6 @@
           <w:bCs w:val="false"/>
           <w:i w:val="false"/>
           <w:iCs w:val="false"/>
-          <w:strike/>
           <w:sz w:val="20"/>
           <w:szCs w:val="20"/>
         </w:rPr>
@@ -2166,7 +2051,6 @@
           <w:bCs w:val="false"/>
           <w:i w:val="false"/>
           <w:iCs w:val="false"/>
-          <w:strike/>
           <w:sz w:val="20"/>
           <w:szCs w:val="20"/>
         </w:rPr>
@@ -2179,7 +2063,6 @@
           <w:bCs w:val="false"/>
           <w:i w:val="false"/>
           <w:iCs w:val="false"/>
-          <w:strike/>
           <w:sz w:val="20"/>
           <w:szCs w:val="20"/>
           <w:vertAlign w:val="superscript"/>
@@ -2193,7 +2076,6 @@
           <w:bCs w:val="false"/>
           <w:i w:val="false"/>
           <w:iCs w:val="false"/>
-          <w:strike/>
           <w:sz w:val="20"/>
           <w:szCs w:val="20"/>
         </w:rPr>
@@ -2206,7 +2088,6 @@
           <w:bCs w:val="false"/>
           <w:i w:val="false"/>
           <w:iCs w:val="false"/>
-          <w:strike/>
           <w:sz w:val="20"/>
           <w:szCs w:val="20"/>
           <w:vertAlign w:val="superscript"/>
@@ -2220,7 +2101,6 @@
           <w:bCs w:val="false"/>
           <w:i w:val="false"/>
           <w:iCs w:val="false"/>
-          <w:strike/>
           <w:sz w:val="20"/>
           <w:szCs w:val="20"/>
         </w:rPr>
@@ -2234,7 +2114,6 @@
             <w:bCs w:val="false"/>
             <w:i w:val="false"/>
             <w:iCs w:val="false"/>
-            <w:strike/>
             <w:color w:val="0000EE"/>
             <w:sz w:val="20"/>
             <w:szCs w:val="20"/>
@@ -2251,7 +2130,6 @@
             <w:bCs w:val="false"/>
             <w:i w:val="false"/>
             <w:iCs w:val="false"/>
-            <w:strike/>
             <w:color w:val="0000EE"/>
             <w:sz w:val="20"/>
             <w:szCs w:val="20"/>
@@ -2269,7 +2147,6 @@
             <w:bCs w:val="false"/>
             <w:i w:val="false"/>
             <w:iCs w:val="false"/>
-            <w:strike/>
             <w:color w:val="0000EE"/>
             <w:sz w:val="20"/>
             <w:szCs w:val="20"/>
@@ -2285,7 +2162,6 @@
           <w:bCs w:val="false"/>
           <w:i w:val="false"/>
           <w:iCs w:val="false"/>
-          <w:strike/>
           <w:sz w:val="20"/>
           <w:szCs w:val="20"/>
         </w:rPr>
@@ -2299,7 +2175,6 @@
             <w:bCs w:val="false"/>
             <w:i w:val="false"/>
             <w:iCs w:val="false"/>
-            <w:strike/>
             <w:color w:val="0000EE"/>
             <w:sz w:val="20"/>
             <w:szCs w:val="20"/>
@@ -2315,7 +2190,6 @@
           <w:bCs w:val="false"/>
           <w:i w:val="false"/>
           <w:iCs w:val="false"/>
-          <w:strike/>
           <w:sz w:val="20"/>
           <w:szCs w:val="20"/>
         </w:rPr>
@@ -2329,7 +2203,6 @@
             <w:bCs w:val="false"/>
             <w:i w:val="false"/>
             <w:iCs w:val="false"/>
-            <w:strike/>
             <w:color w:val="0000EE"/>
             <w:sz w:val="20"/>
             <w:szCs w:val="20"/>
@@ -2345,7 +2218,6 @@
           <w:bCs w:val="false"/>
           <w:i w:val="false"/>
           <w:iCs w:val="false"/>
-          <w:strike/>
           <w:sz w:val="20"/>
           <w:szCs w:val="20"/>
         </w:rPr>
@@ -2359,7 +2231,6 @@
             <w:bCs w:val="false"/>
             <w:i w:val="false"/>
             <w:iCs w:val="false"/>
-            <w:strike/>
             <w:color w:val="0000EE"/>
             <w:sz w:val="20"/>
             <w:szCs w:val="20"/>
@@ -2375,7 +2246,6 @@
           <w:bCs w:val="false"/>
           <w:i w:val="false"/>
           <w:iCs w:val="false"/>
-          <w:strike/>
           <w:sz w:val="20"/>
           <w:szCs w:val="20"/>
         </w:rPr>
@@ -2388,7 +2258,6 @@
           <w:bCs w:val="false"/>
           <w:i w:val="false"/>
           <w:iCs w:val="false"/>
-          <w:strike w:val="false"/>
           <w:sz w:val="20"/>
           <w:szCs w:val="20"/>
         </w:rPr>
@@ -2402,7 +2271,6 @@
             <w:bCs w:val="false"/>
             <w:i w:val="false"/>
             <w:iCs w:val="false"/>
-            <w:strike w:val="false"/>
             <w:color w:val="0000EE"/>
             <w:sz w:val="20"/>
             <w:szCs w:val="20"/>
@@ -2418,7 +2286,6 @@
           <w:bCs w:val="false"/>
           <w:i w:val="false"/>
           <w:iCs w:val="false"/>
-          <w:strike w:val="false"/>
           <w:sz w:val="20"/>
           <w:szCs w:val="20"/>
         </w:rPr>
@@ -2432,7 +2299,6 @@
             <w:bCs w:val="false"/>
             <w:i w:val="false"/>
             <w:iCs w:val="false"/>
-            <w:strike w:val="false"/>
             <w:color w:val="0000EE"/>
             <w:sz w:val="20"/>
             <w:szCs w:val="20"/>
@@ -2455,7 +2321,6 @@
           <w:bCs w:val="false"/>
           <w:i w:val="false"/>
           <w:iCs w:val="false"/>
-          <w:strike/>
           <w:sz w:val="20"/>
           <w:szCs w:val="20"/>
         </w:rPr>
@@ -2475,7 +2340,6 @@
           <w:bCs w:val="false"/>
           <w:i w:val="false"/>
           <w:iCs w:val="false"/>
-          <w:strike/>
           <w:sz w:val="20"/>
           <w:szCs w:val="20"/>
         </w:rPr>
@@ -2495,7 +2359,6 @@
           <w:bCs w:val="false"/>
           <w:i w:val="false"/>
           <w:iCs w:val="false"/>
-          <w:strike/>
           <w:sz w:val="20"/>
           <w:szCs w:val="20"/>
         </w:rPr>
@@ -2515,7 +2378,6 @@
           <w:bCs w:val="false"/>
           <w:i w:val="false"/>
           <w:iCs w:val="false"/>
-          <w:strike/>
           <w:sz w:val="20"/>
           <w:szCs w:val="20"/>
         </w:rPr>
@@ -2528,7 +2390,6 @@
           <w:bCs w:val="false"/>
           <w:i w:val="false"/>
           <w:iCs w:val="false"/>
-          <w:strike/>
           <w:sz w:val="20"/>
           <w:szCs w:val="20"/>
           <w:vertAlign w:val="superscript"/>
@@ -2542,7 +2403,6 @@
           <w:bCs w:val="false"/>
           <w:i w:val="false"/>
           <w:iCs w:val="false"/>
-          <w:strike/>
           <w:sz w:val="20"/>
           <w:szCs w:val="20"/>
         </w:rPr>
@@ -2562,7 +2422,6 @@
           <w:bCs w:val="false"/>
           <w:i w:val="false"/>
           <w:iCs w:val="false"/>
-          <w:strike/>
           <w:sz w:val="20"/>
           <w:szCs w:val="20"/>
         </w:rPr>
@@ -2575,7 +2434,6 @@
           <w:bCs w:val="false"/>
           <w:i w:val="false"/>
           <w:iCs w:val="false"/>
-          <w:strike/>
           <w:sz w:val="20"/>
           <w:szCs w:val="20"/>
           <w:vertAlign w:val="superscript"/>
@@ -2589,7 +2447,6 @@
           <w:bCs w:val="false"/>
           <w:i w:val="false"/>
           <w:iCs w:val="false"/>
-          <w:strike/>
           <w:sz w:val="20"/>
           <w:szCs w:val="20"/>
         </w:rPr>
@@ -2609,7 +2466,6 @@
           <w:bCs w:val="false"/>
           <w:i w:val="false"/>
           <w:iCs w:val="false"/>
-          <w:strike/>
           <w:sz w:val="20"/>
           <w:szCs w:val="20"/>
         </w:rPr>
@@ -2622,7 +2478,6 @@
           <w:bCs w:val="false"/>
           <w:i w:val="false"/>
           <w:iCs w:val="false"/>
-          <w:strike/>
           <w:sz w:val="20"/>
           <w:szCs w:val="20"/>
           <w:vertAlign w:val="superscript"/>
@@ -2636,7 +2491,6 @@
           <w:bCs w:val="false"/>
           <w:i w:val="false"/>
           <w:iCs w:val="false"/>
-          <w:strike/>
           <w:sz w:val="20"/>
           <w:szCs w:val="20"/>
         </w:rPr>
@@ -2656,7 +2510,6 @@
           <w:bCs w:val="false"/>
           <w:i w:val="false"/>
           <w:iCs w:val="false"/>
-          <w:strike/>
           <w:sz w:val="20"/>
           <w:szCs w:val="20"/>
         </w:rPr>
@@ -2669,7 +2522,6 @@
           <w:bCs w:val="false"/>
           <w:i w:val="false"/>
           <w:iCs w:val="false"/>
-          <w:strike/>
           <w:sz w:val="20"/>
           <w:szCs w:val="20"/>
           <w:vertAlign w:val="superscript"/>
@@ -2683,7 +2535,6 @@
           <w:bCs w:val="false"/>
           <w:i w:val="false"/>
           <w:iCs w:val="false"/>
-          <w:strike/>
           <w:sz w:val="20"/>
           <w:szCs w:val="20"/>
         </w:rPr>
@@ -2696,7 +2547,6 @@
           <w:bCs w:val="false"/>
           <w:i w:val="false"/>
           <w:iCs w:val="false"/>
-          <w:strike/>
           <w:sz w:val="20"/>
           <w:szCs w:val="20"/>
           <w:vertAlign w:val="superscript"/>
@@ -2710,7 +2560,6 @@
           <w:bCs w:val="false"/>
           <w:i w:val="false"/>
           <w:iCs w:val="false"/>
-          <w:strike/>
           <w:sz w:val="20"/>
           <w:szCs w:val="20"/>
         </w:rPr>
@@ -2730,7 +2579,6 @@
           <w:bCs w:val="false"/>
           <w:i w:val="false"/>
           <w:iCs w:val="false"/>
-          <w:strike/>
           <w:sz w:val="20"/>
           <w:szCs w:val="20"/>
         </w:rPr>
@@ -2743,7 +2591,6 @@
           <w:bCs w:val="false"/>
           <w:i w:val="false"/>
           <w:iCs w:val="false"/>
-          <w:strike/>
           <w:sz w:val="20"/>
           <w:szCs w:val="20"/>
           <w:vertAlign w:val="superscript"/>
@@ -2757,7 +2604,6 @@
           <w:bCs w:val="false"/>
           <w:i w:val="false"/>
           <w:iCs w:val="false"/>
-          <w:strike/>
           <w:sz w:val="20"/>
           <w:szCs w:val="20"/>
         </w:rPr>
@@ -2777,7 +2623,6 @@
           <w:bCs w:val="false"/>
           <w:i w:val="false"/>
           <w:iCs w:val="false"/>
-          <w:strike/>
           <w:sz w:val="20"/>
           <w:szCs w:val="20"/>
         </w:rPr>
@@ -2790,7 +2635,6 @@
           <w:bCs w:val="false"/>
           <w:i w:val="false"/>
           <w:iCs w:val="false"/>
-          <w:strike/>
           <w:sz w:val="20"/>
           <w:szCs w:val="20"/>
           <w:vertAlign w:val="superscript"/>
@@ -2804,7 +2648,6 @@
           <w:bCs w:val="false"/>
           <w:i w:val="false"/>
           <w:iCs w:val="false"/>
-          <w:strike/>
           <w:sz w:val="20"/>
           <w:szCs w:val="20"/>
         </w:rPr>
@@ -2824,7 +2667,6 @@
           <w:bCs w:val="false"/>
           <w:i w:val="false"/>
           <w:iCs w:val="false"/>
-          <w:strike/>
           <w:sz w:val="20"/>
           <w:szCs w:val="20"/>
         </w:rPr>
@@ -2838,7 +2680,6 @@
             <w:bCs w:val="false"/>
             <w:i w:val="false"/>
             <w:iCs w:val="false"/>
-            <w:strike/>
             <w:color w:val="0000EE"/>
             <w:sz w:val="20"/>
             <w:szCs w:val="20"/>
@@ -2854,7 +2695,6 @@
           <w:bCs w:val="false"/>
           <w:i w:val="false"/>
           <w:iCs w:val="false"/>
-          <w:strike/>
           <w:sz w:val="20"/>
           <w:szCs w:val="20"/>
         </w:rPr>
@@ -2868,7 +2708,6 @@
             <w:bCs w:val="false"/>
             <w:i w:val="false"/>
             <w:iCs w:val="false"/>
-            <w:strike/>
             <w:color w:val="0000EE"/>
             <w:sz w:val="20"/>
             <w:szCs w:val="20"/>
@@ -2885,7 +2724,6 @@
             <w:bCs w:val="false"/>
             <w:i w:val="false"/>
             <w:iCs w:val="false"/>
-            <w:strike/>
             <w:color w:val="0000EE"/>
             <w:sz w:val="20"/>
             <w:szCs w:val="20"/>
@@ -2903,7 +2741,6 @@
             <w:bCs w:val="false"/>
             <w:i w:val="false"/>
             <w:iCs w:val="false"/>
-            <w:strike/>
             <w:color w:val="0000EE"/>
             <w:sz w:val="20"/>
             <w:szCs w:val="20"/>
@@ -2919,7 +2756,6 @@
           <w:bCs w:val="false"/>
           <w:i w:val="false"/>
           <w:iCs w:val="false"/>
-          <w:strike/>
           <w:sz w:val="20"/>
           <w:szCs w:val="20"/>
         </w:rPr>
@@ -4528,7 +4364,6 @@
           <w:bCs w:val="false"/>
           <w:i w:val="false"/>
           <w:iCs w:val="false"/>
-          <w:strike/>
           <w:sz w:val="20"/>
           <w:szCs w:val="20"/>
         </w:rPr>
@@ -4542,7 +4377,6 @@
             <w:bCs w:val="false"/>
             <w:i w:val="false"/>
             <w:iCs w:val="false"/>
-            <w:strike/>
             <w:color w:val="0000EE"/>
             <w:sz w:val="20"/>
             <w:szCs w:val="20"/>
@@ -4558,7 +4392,6 @@
           <w:bCs w:val="false"/>
           <w:i w:val="false"/>
           <w:iCs w:val="false"/>
-          <w:strike/>
           <w:sz w:val="20"/>
           <w:szCs w:val="20"/>
         </w:rPr>
@@ -4571,7 +4404,6 @@
           <w:bCs w:val="false"/>
           <w:i w:val="false"/>
           <w:iCs w:val="false"/>
-          <w:strike w:val="false"/>
           <w:sz w:val="20"/>
           <w:szCs w:val="20"/>
         </w:rPr>
@@ -4584,7 +4416,6 @@
           <w:bCs w:val="false"/>
           <w:i w:val="false"/>
           <w:iCs w:val="false"/>
-          <w:strike/>
           <w:sz w:val="20"/>
           <w:szCs w:val="20"/>
         </w:rPr>
@@ -4598,7 +4429,6 @@
             <w:bCs w:val="false"/>
             <w:i w:val="false"/>
             <w:iCs w:val="false"/>
-            <w:strike/>
             <w:color w:val="0000EE"/>
             <w:sz w:val="20"/>
             <w:szCs w:val="20"/>
@@ -4614,7 +4444,6 @@
           <w:bCs w:val="false"/>
           <w:i w:val="false"/>
           <w:iCs w:val="false"/>
-          <w:strike/>
           <w:sz w:val="20"/>
           <w:szCs w:val="20"/>
         </w:rPr>
@@ -4628,7 +4457,6 @@
             <w:bCs w:val="false"/>
             <w:i w:val="false"/>
             <w:iCs w:val="false"/>
-            <w:strike w:val="false"/>
             <w:color w:val="0000EE"/>
             <w:sz w:val="20"/>
             <w:szCs w:val="20"/>
@@ -4644,7 +4472,6 @@
           <w:bCs w:val="false"/>
           <w:i w:val="false"/>
           <w:iCs w:val="false"/>
-          <w:strike w:val="false"/>
           <w:sz w:val="20"/>
           <w:szCs w:val="20"/>
         </w:rPr>
@@ -4658,7 +4485,6 @@
             <w:bCs w:val="false"/>
             <w:i w:val="false"/>
             <w:iCs w:val="false"/>
-            <w:strike w:val="false"/>
             <w:color w:val="0000EE"/>
             <w:sz w:val="20"/>
             <w:szCs w:val="20"/>
@@ -4681,7 +4507,6 @@
           <w:bCs w:val="false"/>
           <w:i w:val="false"/>
           <w:iCs w:val="false"/>
-          <w:strike/>
           <w:sz w:val="20"/>
           <w:szCs w:val="20"/>
         </w:rPr>
@@ -4695,7 +4520,6 @@
             <w:bCs w:val="false"/>
             <w:i w:val="false"/>
             <w:iCs w:val="false"/>
-            <w:strike/>
             <w:color w:val="0000EE"/>
             <w:sz w:val="20"/>
             <w:szCs w:val="20"/>
@@ -4711,7 +4535,6 @@
           <w:bCs w:val="false"/>
           <w:i w:val="false"/>
           <w:iCs w:val="false"/>
-          <w:strike/>
           <w:sz w:val="20"/>
           <w:szCs w:val="20"/>
         </w:rPr>
@@ -4724,7 +4547,6 @@
           <w:bCs w:val="false"/>
           <w:i w:val="false"/>
           <w:iCs w:val="false"/>
-          <w:strike/>
           <w:sz w:val="20"/>
           <w:szCs w:val="20"/>
           <w:vertAlign w:val="superscript"/>
@@ -4738,7 +4560,6 @@
           <w:bCs w:val="false"/>
           <w:i w:val="false"/>
           <w:iCs w:val="false"/>
-          <w:strike/>
           <w:sz w:val="20"/>
           <w:szCs w:val="20"/>
         </w:rPr>

</xml_diff>